<commit_message>
docs: simplify developer manual and add references
</commit_message>
<xml_diff>
--- a/LetzRyd_WalkIn_Registry_Documentation.docx
+++ b/LetzRyd_WalkIn_Registry_Documentation.docx
@@ -4,60 +4,16 @@
   <w:body>
     <w:p>
       <w:pPr>
-        <w:jc w:val="center"/>
+        <w:spacing w:after="240"/>
       </w:pPr>
       <w:r>
         <w:rPr>
-          <w:rFonts w:ascii="Arial" w:hAnsi="Arial"/>
+          <w:rFonts w:ascii="Segoe UI" w:hAnsi="Segoe UI"/>
           <w:b/>
           <w:color w:val="0A1650"/>
-          <w:sz w:val="52"/>
+          <w:sz w:val="40"/>
         </w:rPr>
-        <w:t>LetzRyd · Walk-In Registry</w:t>
-      </w:r>
-    </w:p>
-    <w:p>
-      <w:pPr>
-        <w:jc w:val="center"/>
-      </w:pPr>
-      <w:r>
-        <w:rPr>
-          <w:rFonts w:ascii="Arial" w:hAnsi="Arial"/>
-          <w:i/>
-          <w:color w:val="1AB394"/>
-          <w:sz w:val="32"/>
-        </w:rPr>
-        <w:t>Developer &amp; Operations Operations Manual</w:t>
-      </w:r>
-    </w:p>
-    <w:p>
-      <w:pPr>
-        <w:jc w:val="center"/>
-      </w:pPr>
-      <w:r>
-        <w:rPr>
-          <w:color w:val="64748B"/>
-          <w:sz w:val="20"/>
-        </w:rPr>
-        <w:t>Generated: June 26, 2026  |  LetzRyd Operations</w:t>
-      </w:r>
-    </w:p>
-    <w:p>
-      <w:pPr>
-        <w:spacing w:after="480"/>
-      </w:pPr>
-    </w:p>
-    <w:p>
-      <w:pPr>
-        <w:spacing w:before="360" w:after="120"/>
-      </w:pPr>
-      <w:r>
-        <w:rPr>
-          <w:b/>
-          <w:color w:val="0A1650"/>
-          <w:sz w:val="36"/>
-        </w:rPr>
-        <w:t>1. Executive Summary</w:t>
+        <w:t>LetzRyd Walk-In Registry — Developer Docs</w:t>
       </w:r>
     </w:p>
     <w:p>
@@ -65,469 +21,138 @@
         <w:spacing w:after="240"/>
       </w:pPr>
       <w:r>
-        <w:t>The LetzRyd Walk-In Registry application is a digital operations platform designed for managing real-time driver onboardings, candidate registrations, and business queries. The system has been rebuilt to match the premium LetzRyd theme and features a highly responsive, 2-column digital check-in form, real-time analytics dashboards, and a live records database interface. Under the hood, the system is backed by a secure PostgreSQL database, connecting to the frontend via a high-performance FastAPI backend.</w:t>
+        <w:t>Here are the developer notes for the Walk-In Registry project. It contains details on how the codebase is structured, how the database is connected, and how to use it to build new forms.</w:t>
       </w:r>
     </w:p>
     <w:p>
       <w:pPr>
-        <w:spacing w:before="360" w:after="120"/>
+        <w:spacing w:before="280" w:after="80"/>
       </w:pPr>
       <w:r>
         <w:rPr>
           <w:b/>
           <w:color w:val="0A1650"/>
-          <w:sz w:val="36"/>
+          <w:sz w:val="28"/>
         </w:rPr>
-        <w:t>2. Codebase Architecture &amp; Tech Stack</w:t>
+        <w:t>1. Tech Stack</w:t>
+      </w:r>
+    </w:p>
+    <w:p>
+      <w:r>
+        <w:t>I built this application using the following technologies:</w:t>
       </w:r>
     </w:p>
     <w:p>
       <w:pPr>
-        <w:spacing w:after="120"/>
+        <w:pStyle w:val="ListBullet"/>
       </w:pPr>
       <w:r>
-        <w:t>The application operates as a single-repository monorepo structured as follows:</w:t>
+        <w:rPr>
+          <w:b/>
+        </w:rPr>
+        <w:t xml:space="preserve">Frontend: </w:t>
       </w:r>
-    </w:p>
-    <w:tbl>
-      <w:tblPr>
-        <w:tblStyle w:val="LightShading-Accent1"/>
-        <w:tblW w:type="auto" w:w="0"/>
-        <w:tblLook w:firstColumn="1" w:firstRow="1" w:lastColumn="0" w:lastRow="0" w:noHBand="0" w:noVBand="1" w:val="04A0"/>
-      </w:tblPr>
-      <w:tblGrid>
-        <w:gridCol w:w="4320"/>
-        <w:gridCol w:w="4320"/>
-      </w:tblGrid>
-      <w:tr>
-        <w:tc>
-          <w:tcPr>
-            <w:tcW w:type="dxa" w:w="4320"/>
-          </w:tcPr>
-          <w:p>
-            <w:r>
-              <w:t>File / Folder</w:t>
-            </w:r>
-          </w:p>
-        </w:tc>
-        <w:tc>
-          <w:tcPr>
-            <w:tcW w:type="dxa" w:w="4320"/>
-          </w:tcPr>
-          <w:p>
-            <w:r>
-              <w:t>Description &amp; Responsibility</w:t>
-            </w:r>
-          </w:p>
-        </w:tc>
-      </w:tr>
-      <w:tr>
-        <w:tc>
-          <w:tcPr>
-            <w:tcW w:type="dxa" w:w="4320"/>
-          </w:tcPr>
-          <w:p>
-            <w:r>
-              <w:rPr>
-                <w:b/>
-              </w:rPr>
-              <w:t>index.html</w:t>
-            </w:r>
-          </w:p>
-        </w:tc>
-        <w:tc>
-          <w:tcPr>
-            <w:tcW w:type="dxa" w:w="4320"/>
-          </w:tcPr>
-          <w:p>
-            <w:r>
-              <w:t>The primary user interface. Includes tab-based navigation for Form Check-In and the Walk-In Database, and CDN links for JQuery &amp; SurveyJS.</w:t>
-            </w:r>
-          </w:p>
-        </w:tc>
-      </w:tr>
-      <w:tr>
-        <w:tc>
-          <w:tcPr>
-            <w:tcW w:type="dxa" w:w="4320"/>
-          </w:tcPr>
-          <w:p>
-            <w:r>
-              <w:rPr>
-                <w:b/>
-              </w:rPr>
-              <w:t>index.css</w:t>
-            </w:r>
-          </w:p>
-        </w:tc>
-        <w:tc>
-          <w:tcPr>
-            <w:tcW w:type="dxa" w:w="4320"/>
-          </w:tcPr>
-          <w:p>
-            <w:r>
-              <w:t>Contains all layout overrides, brand styling variables, and SurveyJS modern overrides (such as compact file uploads and custom choice selectors).</w:t>
-            </w:r>
-          </w:p>
-        </w:tc>
-      </w:tr>
-      <w:tr>
-        <w:tc>
-          <w:tcPr>
-            <w:tcW w:type="dxa" w:w="4320"/>
-          </w:tcPr>
-          <w:p>
-            <w:r>
-              <w:rPr>
-                <w:b/>
-              </w:rPr>
-              <w:t>script.js</w:t>
-            </w:r>
-          </w:p>
-        </w:tc>
-        <w:tc>
-          <w:tcPr>
-            <w:tcW w:type="dxa" w:w="4320"/>
-          </w:tcPr>
-          <w:p>
-            <w:r>
-              <w:t>Frontend logic. Handles tab switching, local clock, SurveyJS initialization, database retrieval, CSV export, and REST API communications.</w:t>
-            </w:r>
-          </w:p>
-        </w:tc>
-      </w:tr>
-      <w:tr>
-        <w:tc>
-          <w:tcPr>
-            <w:tcW w:type="dxa" w:w="4320"/>
-          </w:tcPr>
-          <w:p>
-            <w:r>
-              <w:rPr>
-                <w:b/>
-              </w:rPr>
-              <w:t>main.py</w:t>
-            </w:r>
-          </w:p>
-        </w:tc>
-        <w:tc>
-          <w:tcPr>
-            <w:tcW w:type="dxa" w:w="4320"/>
-          </w:tcPr>
-          <w:p>
-            <w:r>
-              <w:t>The FastAPI application backend. Manages PostgreSQL connection pooling, seed tables initialization, and routes for stats, cities, executives, and walkins.</w:t>
-            </w:r>
-          </w:p>
-        </w:tc>
-      </w:tr>
-      <w:tr>
-        <w:tc>
-          <w:tcPr>
-            <w:tcW w:type="dxa" w:w="4320"/>
-          </w:tcPr>
-          <w:p>
-            <w:r>
-              <w:rPr>
-                <w:b/>
-              </w:rPr>
-              <w:t>requirements.txt</w:t>
-            </w:r>
-          </w:p>
-        </w:tc>
-        <w:tc>
-          <w:tcPr>
-            <w:tcW w:type="dxa" w:w="4320"/>
-          </w:tcPr>
-          <w:p>
-            <w:r>
-              <w:t>Lists all Python backend dependencies (fastapi, uvicorn, psycopg2-binary, pydantic).</w:t>
-            </w:r>
-          </w:p>
-        </w:tc>
-      </w:tr>
-    </w:tbl>
-    <w:p>
-      <w:pPr>
-        <w:spacing w:after="240"/>
-      </w:pPr>
+      <w:r>
+        <w:t>Vanilla HTML5 + CSS3 + jQuery + SurveyJS (V2 Modern Theme).</w:t>
+      </w:r>
     </w:p>
     <w:p>
       <w:pPr>
-        <w:spacing w:before="360" w:after="120"/>
+        <w:pStyle w:val="ListBullet"/>
+      </w:pPr>
+      <w:r>
+        <w:rPr>
+          <w:b/>
+        </w:rPr>
+        <w:t xml:space="preserve">Backend: </w:t>
+      </w:r>
+      <w:r>
+        <w:t>Python + FastAPI + PostgreSQL (using Psycopg2 connection pool).</w:t>
+      </w:r>
+    </w:p>
+    <w:p>
+      <w:pPr>
+        <w:spacing w:before="280" w:after="80"/>
       </w:pPr>
       <w:r>
         <w:rPr>
           <w:b/>
           <w:color w:val="0A1650"/>
-          <w:sz w:val="36"/>
+          <w:sz w:val="28"/>
         </w:rPr>
-        <w:t>3. Database Schema &amp; Connection Logic</w:t>
+        <w:t>2. Reference Links</w:t>
       </w:r>
     </w:p>
     <w:p>
       <w:pPr>
-        <w:spacing w:after="120"/>
+        <w:pStyle w:val="ListBullet"/>
       </w:pPr>
       <w:r>
-        <w:t>Connection parameters are loaded from environment variables in main.py. A SimpleConnectionPool manages PostgreSQL connections efficiently. Below is the list of env variables required:</w:t>
+        <w:rPr>
+          <w:b/>
+        </w:rPr>
+        <w:t xml:space="preserve">LetzRyd Website: </w:t>
       </w:r>
-    </w:p>
-    <w:tbl>
-      <w:tblPr>
-        <w:tblStyle w:val="LightShading-Accent1"/>
-        <w:tblW w:type="auto" w:w="0"/>
-        <w:tblLook w:firstColumn="1" w:firstRow="1" w:lastColumn="0" w:lastRow="0" w:noHBand="0" w:noVBand="1" w:val="04A0"/>
-      </w:tblPr>
-      <w:tblGrid>
-        <w:gridCol w:w="2880"/>
-        <w:gridCol w:w="2880"/>
-        <w:gridCol w:w="2880"/>
-      </w:tblGrid>
-      <w:tr>
-        <w:tc>
-          <w:tcPr>
-            <w:tcW w:type="dxa" w:w="2880"/>
-          </w:tcPr>
-          <w:p>
-            <w:r>
-              <w:t>Env Variable</w:t>
-            </w:r>
-          </w:p>
-        </w:tc>
-        <w:tc>
-          <w:tcPr>
-            <w:tcW w:type="dxa" w:w="2880"/>
-          </w:tcPr>
-          <w:p>
-            <w:r>
-              <w:t>Default Value</w:t>
-            </w:r>
-          </w:p>
-        </w:tc>
-        <w:tc>
-          <w:tcPr>
-            <w:tcW w:type="dxa" w:w="2880"/>
-          </w:tcPr>
-          <w:p>
-            <w:r>
-              <w:t>Description</w:t>
-            </w:r>
-          </w:p>
-        </w:tc>
-      </w:tr>
-      <w:tr>
-        <w:tc>
-          <w:tcPr>
-            <w:tcW w:type="dxa" w:w="2880"/>
-          </w:tcPr>
-          <w:p>
-            <w:r>
-              <w:rPr>
-                <w:b/>
-              </w:rPr>
-              <w:t>DB_HOST</w:t>
-            </w:r>
-          </w:p>
-        </w:tc>
-        <w:tc>
-          <w:tcPr>
-            <w:tcW w:type="dxa" w:w="2880"/>
-          </w:tcPr>
-          <w:p>
-            <w:r>
-              <w:t>35.200.196.113</w:t>
-            </w:r>
-          </w:p>
-        </w:tc>
-        <w:tc>
-          <w:tcPr>
-            <w:tcW w:type="dxa" w:w="2880"/>
-          </w:tcPr>
-          <w:p>
-            <w:r>
-              <w:t>IP address/hostname of the PostgreSQL server.</w:t>
-            </w:r>
-          </w:p>
-        </w:tc>
-      </w:tr>
-      <w:tr>
-        <w:tc>
-          <w:tcPr>
-            <w:tcW w:type="dxa" w:w="2880"/>
-          </w:tcPr>
-          <w:p>
-            <w:r>
-              <w:rPr>
-                <w:b/>
-              </w:rPr>
-              <w:t>DB_USER</w:t>
-            </w:r>
-          </w:p>
-        </w:tc>
-        <w:tc>
-          <w:tcPr>
-            <w:tcW w:type="dxa" w:w="2880"/>
-          </w:tcPr>
-          <w:p>
-            <w:r>
-              <w:t>postgres</w:t>
-            </w:r>
-          </w:p>
-        </w:tc>
-        <w:tc>
-          <w:tcPr>
-            <w:tcW w:type="dxa" w:w="2880"/>
-          </w:tcPr>
-          <w:p>
-            <w:r>
-              <w:t>Username for database authentication.</w:t>
-            </w:r>
-          </w:p>
-        </w:tc>
-      </w:tr>
-      <w:tr>
-        <w:tc>
-          <w:tcPr>
-            <w:tcW w:type="dxa" w:w="2880"/>
-          </w:tcPr>
-          <w:p>
-            <w:r>
-              <w:rPr>
-                <w:b/>
-              </w:rPr>
-              <w:t>DB_PASS</w:t>
-            </w:r>
-          </w:p>
-        </w:tc>
-        <w:tc>
-          <w:tcPr>
-            <w:tcW w:type="dxa" w:w="2880"/>
-          </w:tcPr>
-          <w:p>
-            <w:r>
-              <w:t>********</w:t>
-            </w:r>
-          </w:p>
-        </w:tc>
-        <w:tc>
-          <w:tcPr>
-            <w:tcW w:type="dxa" w:w="2880"/>
-          </w:tcPr>
-          <w:p>
-            <w:r>
-              <w:t>Password for database authentication.</w:t>
-            </w:r>
-          </w:p>
-        </w:tc>
-      </w:tr>
-      <w:tr>
-        <w:tc>
-          <w:tcPr>
-            <w:tcW w:type="dxa" w:w="2880"/>
-          </w:tcPr>
-          <w:p>
-            <w:r>
-              <w:rPr>
-                <w:b/>
-              </w:rPr>
-              <w:t>DB_NAME</w:t>
-            </w:r>
-          </w:p>
-        </w:tc>
-        <w:tc>
-          <w:tcPr>
-            <w:tcW w:type="dxa" w:w="2880"/>
-          </w:tcPr>
-          <w:p>
-            <w:r>
-              <w:t>postgres</w:t>
-            </w:r>
-          </w:p>
-        </w:tc>
-        <w:tc>
-          <w:tcPr>
-            <w:tcW w:type="dxa" w:w="2880"/>
-          </w:tcPr>
-          <w:p>
-            <w:r>
-              <w:t>Database name within PostgreSQL.</w:t>
-            </w:r>
-          </w:p>
-        </w:tc>
-      </w:tr>
-      <w:tr>
-        <w:tc>
-          <w:tcPr>
-            <w:tcW w:type="dxa" w:w="2880"/>
-          </w:tcPr>
-          <w:p>
-            <w:r>
-              <w:rPr>
-                <w:b/>
-              </w:rPr>
-              <w:t>DB_PORT</w:t>
-            </w:r>
-          </w:p>
-        </w:tc>
-        <w:tc>
-          <w:tcPr>
-            <w:tcW w:type="dxa" w:w="2880"/>
-          </w:tcPr>
-          <w:p>
-            <w:r>
-              <w:t>5432</w:t>
-            </w:r>
-          </w:p>
-        </w:tc>
-        <w:tc>
-          <w:tcPr>
-            <w:tcW w:type="dxa" w:w="2880"/>
-          </w:tcPr>
-          <w:p>
-            <w:r>
-              <w:t>Port for database traffic.</w:t>
-            </w:r>
-          </w:p>
-        </w:tc>
-      </w:tr>
-    </w:tbl>
-    <w:p>
-      <w:pPr>
-        <w:spacing w:after="240"/>
-      </w:pPr>
+      <w:r>
+        <w:rPr>
+          <w:color w:val="2563EB"/>
+          <w:u w:val="single"/>
+        </w:rPr>
+        <w:t>https://letzryd.com</w:t>
+      </w:r>
     </w:p>
     <w:p>
       <w:pPr>
-        <w:spacing w:before="360" w:after="120"/>
+        <w:pStyle w:val="ListBullet"/>
+      </w:pPr>
+      <w:r>
+        <w:rPr>
+          <w:b/>
+        </w:rPr>
+        <w:t xml:space="preserve">Code Repository: </w:t>
+      </w:r>
+      <w:r>
+        <w:rPr>
+          <w:color w:val="2563EB"/>
+          <w:u w:val="single"/>
+        </w:rPr>
+        <w:t>https://github.com/aayush-letzryd/walkin</w:t>
+      </w:r>
+    </w:p>
+    <w:p>
+      <w:pPr>
+        <w:pStyle w:val="ListBullet"/>
+      </w:pPr>
+      <w:r>
+        <w:rPr>
+          <w:b/>
+        </w:rPr>
+        <w:t xml:space="preserve">SurveyJS Official Documentation: </w:t>
+      </w:r>
+      <w:r>
+        <w:rPr>
+          <w:color w:val="2563EB"/>
+          <w:u w:val="single"/>
+        </w:rPr>
+        <w:t>https://surveyjs.io</w:t>
+      </w:r>
+    </w:p>
+    <w:p>
+      <w:pPr>
+        <w:spacing w:before="280" w:after="80"/>
       </w:pPr>
       <w:r>
         <w:rPr>
           <w:b/>
           <w:color w:val="0A1650"/>
-          <w:sz w:val="36"/>
+          <w:sz w:val="28"/>
         </w:rPr>
-        <w:t>4. Developer Guide: Creating New Forms with SurveyJS</w:t>
+        <w:t>3. Database Connectivity</w:t>
       </w:r>
     </w:p>
     <w:p>
       <w:r>
-        <w:t>SurveyJS makes form creation simple by separating form structure (defined as JSON) from the underlying HTML rendering. Team members can use the following steps to extend or build new forms:</w:t>
-      </w:r>
-    </w:p>
-    <w:p>
-      <w:r>
-        <w:rPr>
-          <w:b/>
-          <w:color w:val="1AB394"/>
-          <w:sz w:val="28"/>
-        </w:rPr>
-        <w:t>Step 1: Define the Form Schema JSON</w:t>
-      </w:r>
-    </w:p>
-    <w:p>
-      <w:r>
-        <w:t>Open script.js and configure the surveyJson object. Create pages, panels, and elements inside the JSON structure. For example, to add a new text field:</w:t>
+        <w:t>The backend connects to PostgreSQL using environment variables. These are configured in main.py:</w:t>
       </w:r>
     </w:p>
     <w:p>
@@ -537,39 +162,118 @@
       <w:r>
         <w:rPr>
           <w:rFonts w:ascii="Consolas" w:hAnsi="Consolas"/>
-          <w:color w:val="1E293B"/>
           <w:sz w:val="19"/>
         </w:rPr>
-        <w:t>{</w:t>
+        <w:t>DB_HOST = os.environ.get("DB_HOST", "35.200.196.113")</w:t>
         <w:br/>
-        <w:t xml:space="preserve">    type: "text",</w:t>
+        <w:t>DB_USER = os.environ.get("DB_USER", "postgres")</w:t>
         <w:br/>
-        <w:t xml:space="preserve">    name: "vehicle_model",</w:t>
+        <w:t>DB_PASS = os.environ.get("DB_PASS", "your_password")</w:t>
         <w:br/>
-        <w:t xml:space="preserve">    title: "VEHICLE MODEL / YEAR",</w:t>
+        <w:t>DB_NAME = os.environ.get("DB_NAME", "postgres")</w:t>
         <w:br/>
-        <w:t xml:space="preserve">    placeholder: "e.g., Maruti Dzire 2024...",</w:t>
-        <w:br/>
-        <w:t xml:space="preserve">    isRequired: true,</w:t>
-        <w:br/>
-        <w:t xml:space="preserve">    width: "50%"</w:t>
-        <w:br/>
-        <w:t>}</w:t>
+        <w:t>DB_PORT = os.environ.get("DB_PORT", "5432")</w:t>
+      </w:r>
+    </w:p>
+    <w:p>
+      <w:pPr>
+        <w:spacing w:before="280" w:after="80"/>
+      </w:pPr>
+      <w:r>
+        <w:rPr>
+          <w:b/>
+          <w:color w:val="0A1650"/>
+          <w:sz w:val="28"/>
+        </w:rPr>
+        <w:t>4. Codebase Layout</w:t>
+      </w:r>
+    </w:p>
+    <w:p>
+      <w:pPr>
+        <w:pStyle w:val="ListBullet"/>
+      </w:pPr>
+      <w:r>
+        <w:rPr>
+          <w:b/>
+        </w:rPr>
+        <w:t xml:space="preserve">index.html: </w:t>
+      </w:r>
+      <w:r>
+        <w:t>Holds navigation tabs (Form Check-In and Walk-In registry database table). Load SurveyJS stylesheets and scripts via CDNs.</w:t>
+      </w:r>
+    </w:p>
+    <w:p>
+      <w:pPr>
+        <w:pStyle w:val="ListBullet"/>
+      </w:pPr>
+      <w:r>
+        <w:rPr>
+          <w:b/>
+        </w:rPr>
+        <w:t xml:space="preserve">index.css: </w:t>
+      </w:r>
+      <w:r>
+        <w:t>Overriding stylesheet. Defines the theme colors and handles the side-by-side grid display. It also overrides the SurveyJS image preview container height to 88px and renders uploaded cards as small 72x48px thumbnails.</w:t>
+      </w:r>
+    </w:p>
+    <w:p>
+      <w:pPr>
+        <w:pStyle w:val="ListBullet"/>
+      </w:pPr>
+      <w:r>
+        <w:rPr>
+          <w:b/>
+        </w:rPr>
+        <w:t xml:space="preserve">script.js: </w:t>
+      </w:r>
+      <w:r>
+        <w:t>Manages JQuery tabs, fetches metrics and registry data, and contains the SurveyJS JSON structure.</w:t>
+      </w:r>
+    </w:p>
+    <w:p>
+      <w:pPr>
+        <w:pStyle w:val="ListBullet"/>
+      </w:pPr>
+      <w:r>
+        <w:rPr>
+          <w:b/>
+        </w:rPr>
+        <w:t xml:space="preserve">main.py: </w:t>
+      </w:r>
+      <w:r>
+        <w:t>FastAPI server. Sets up table schemas on startup, seeds executives and cities, and exposes endpoints for stats and walkins.</w:t>
+      </w:r>
+    </w:p>
+    <w:p>
+      <w:pPr>
+        <w:spacing w:before="280" w:after="80"/>
+      </w:pPr>
+      <w:r>
+        <w:rPr>
+          <w:b/>
+          <w:color w:val="0A1650"/>
+          <w:sz w:val="28"/>
+        </w:rPr>
+        <w:t>5. How to Create / Modify Forms</w:t>
       </w:r>
     </w:p>
     <w:p>
       <w:r>
-        <w:rPr>
-          <w:b/>
-          <w:color w:val="1AB394"/>
-          <w:sz w:val="28"/>
-        </w:rPr>
-        <w:t>Step 2: Customize Visuals &amp; Grid Layout</w:t>
+        <w:t>You can use the existing form in script.js as a reference. To add new fields:</w:t>
       </w:r>
     </w:p>
     <w:p>
+      <w:pPr>
+        <w:pStyle w:val="ListBullet"/>
+      </w:pPr>
       <w:r>
-        <w:t>To position two questions side-by-side in a single row on desktop, set their widths to "50%" in the JSON, and configure startWithNewLine: false on the second question. To customize elements, edit index.css. All questions wrap in a container with data-name="[question_name]" which allows precise CSS selection:</w:t>
+        <w:rPr>
+          <w:b/>
+        </w:rPr>
+        <w:t xml:space="preserve">Add question object: </w:t>
+      </w:r>
+      <w:r>
+        <w:t>Open script.js and append a new JSON object inside surveyJson.elements. For example:</w:t>
       </w:r>
     </w:p>
     <w:p>
@@ -579,211 +283,125 @@
       <w:r>
         <w:rPr>
           <w:rFonts w:ascii="Consolas" w:hAnsi="Consolas"/>
-          <w:color w:val="1E293B"/>
           <w:sz w:val="19"/>
         </w:rPr>
-        <w:t>/* Custom override for the vehicle model input */</w:t>
+        <w:t>{</w:t>
         <w:br/>
-        <w:t>[data-name="vehicle_model"] input {</w:t>
+        <w:t xml:space="preserve">    type: "text",</w:t>
         <w:br/>
-        <w:t xml:space="preserve">    border: 1px solid var(--brand-green) !important;</w:t>
+        <w:t xml:space="preserve">    name: "whatsapp_number",</w:t>
         <w:br/>
-        <w:t xml:space="preserve">    background-color: #f0fdf4 !important;</w:t>
+        <w:t xml:space="preserve">    title: "WHATSAPP NUMBER",</w:t>
+        <w:br/>
+        <w:t xml:space="preserve">    isRequired: false,</w:t>
+        <w:br/>
+        <w:t xml:space="preserve">    width: "50%",</w:t>
+        <w:br/>
+        <w:t xml:space="preserve">    startWithNewLine: false</w:t>
         <w:br/>
         <w:t>}</w:t>
       </w:r>
     </w:p>
     <w:p>
+      <w:pPr>
+        <w:pStyle w:val="ListBullet"/>
+      </w:pPr>
       <w:r>
         <w:rPr>
           <w:b/>
-          <w:color w:val="1AB394"/>
-          <w:sz w:val="28"/>
         </w:rPr>
-        <w:t>Step 3: Handle Upload Fields &amp; Thumbnail Sizing</w:t>
+        <w:t xml:space="preserve">Side-by-Side grid layout: </w:t>
       </w:r>
-    </w:p>
-    <w:p>
       <w:r>
-        <w:t>When allowMultiple is false for a file question, SurveyJS V2 styles images under .sd-file--single-image by forcing a 288px height. We overrode this behavior to enforce an 88px height and a neat 72x48px thumbnail preview. The choose/remove actions are pinned to the right using absolute positioning inside the parent container. Team members must preserve this class layout structure in index.css to maintain a clean UI.</w:t>
+        <w:t>Set width to "50%" and startWithNewLine: false to force two fields on the same line.</w:t>
       </w:r>
     </w:p>
     <w:p>
       <w:pPr>
-        <w:spacing w:before="360" w:after="120"/>
+        <w:pStyle w:val="ListBullet"/>
+      </w:pPr>
+      <w:r>
+        <w:rPr>
+          <w:b/>
+        </w:rPr>
+        <w:t xml:space="preserve">Styling: </w:t>
+      </w:r>
+      <w:r>
+        <w:t>To override inputs, target them in index.css using their name: [data-name="whatsapp_number"] input { ... }</w:t>
+      </w:r>
+    </w:p>
+    <w:p>
+      <w:pPr>
+        <w:spacing w:before="280" w:after="80"/>
       </w:pPr>
       <w:r>
         <w:rPr>
           <w:b/>
           <w:color w:val="0A1650"/>
-          <w:sz w:val="36"/>
+          <w:sz w:val="28"/>
         </w:rPr>
-        <w:t>5. Repository Operations &amp; Render Deployment</w:t>
+        <w:t>6. Deploying on Render.com</w:t>
       </w:r>
     </w:p>
     <w:p>
       <w:r>
-        <w:rPr>
-          <w:b/>
-          <w:color w:val="1AB394"/>
-          <w:sz w:val="28"/>
-        </w:rPr>
-        <w:t>Repository Syncing</w:t>
-      </w:r>
-    </w:p>
-    <w:p>
-      <w:r>
-        <w:t>The codebase is hosted at https://github.com/aayush-letzryd/walkin. To upload local changes, run the following commands:</w:t>
+        <w:t>To host live on Render, create a new Web Service, link this repo, and set:</w:t>
       </w:r>
     </w:p>
     <w:p>
       <w:pPr>
-        <w:ind w:left="720"/>
+        <w:pStyle w:val="ListBullet"/>
       </w:pPr>
       <w:r>
         <w:rPr>
-          <w:rFonts w:ascii="Consolas" w:hAnsi="Consolas"/>
-          <w:color w:val="1E293B"/>
-          <w:sz w:val="19"/>
+          <w:b/>
         </w:rPr>
-        <w:t>git add .</w:t>
-        <w:br/>
-        <w:t>git commit -m "Your detailed commit message"</w:t>
-        <w:br/>
-        <w:t>git push origin main</w:t>
+        <w:t xml:space="preserve">Runtime: </w:t>
+      </w:r>
+      <w:r>
+        <w:t>Python</w:t>
       </w:r>
     </w:p>
     <w:p>
+      <w:pPr>
+        <w:pStyle w:val="ListBullet"/>
+      </w:pPr>
       <w:r>
         <w:rPr>
           <w:b/>
-          <w:color w:val="1AB394"/>
-          <w:sz w:val="28"/>
         </w:rPr>
-        <w:t>Render.com Deployment Instructions</w:t>
+        <w:t xml:space="preserve">Build Command: </w:t>
+      </w:r>
+      <w:r>
+        <w:t>pip install -r requirements.txt</w:t>
       </w:r>
     </w:p>
     <w:p>
+      <w:pPr>
+        <w:pStyle w:val="ListBullet"/>
+      </w:pPr>
       <w:r>
-        <w:t>To host the application live on Render, create a new Web Service and link the repository. Configure the settings as follow:</w:t>
+        <w:rPr>
+          <w:b/>
+        </w:rPr>
+        <w:t xml:space="preserve">Start Command: </w:t>
+      </w:r>
+      <w:r>
+        <w:t>uvicorn main:app --host 0.0.0.0 --port $PORT</w:t>
       </w:r>
     </w:p>
-    <w:tbl>
-      <w:tblPr>
-        <w:tblStyle w:val="LightShading-Accent1"/>
-        <w:tblW w:type="auto" w:w="0"/>
-        <w:tblLook w:firstColumn="1" w:firstRow="1" w:lastColumn="0" w:lastRow="0" w:noHBand="0" w:noVBand="1" w:val="04A0"/>
-      </w:tblPr>
-      <w:tblGrid>
-        <w:gridCol w:w="4320"/>
-        <w:gridCol w:w="4320"/>
-      </w:tblGrid>
-      <w:tr>
-        <w:tc>
-          <w:tcPr>
-            <w:tcW w:type="dxa" w:w="4320"/>
-          </w:tcPr>
-          <w:p>
-            <w:r>
-              <w:t>Setting</w:t>
-            </w:r>
-          </w:p>
-        </w:tc>
-        <w:tc>
-          <w:tcPr>
-            <w:tcW w:type="dxa" w:w="4320"/>
-          </w:tcPr>
-          <w:p>
-            <w:r>
-              <w:t>Configuration Value</w:t>
-            </w:r>
-          </w:p>
-        </w:tc>
-      </w:tr>
-      <w:tr>
-        <w:tc>
-          <w:tcPr>
-            <w:tcW w:type="dxa" w:w="4320"/>
-          </w:tcPr>
-          <w:p>
-            <w:r>
-              <w:rPr>
-                <w:b/>
-              </w:rPr>
-              <w:t>Runtime</w:t>
-            </w:r>
-          </w:p>
-        </w:tc>
-        <w:tc>
-          <w:tcPr>
-            <w:tcW w:type="dxa" w:w="4320"/>
-          </w:tcPr>
-          <w:p>
-            <w:r>
-              <w:t>Python</w:t>
-            </w:r>
-          </w:p>
-        </w:tc>
-      </w:tr>
-      <w:tr>
-        <w:tc>
-          <w:tcPr>
-            <w:tcW w:type="dxa" w:w="4320"/>
-          </w:tcPr>
-          <w:p>
-            <w:r>
-              <w:rPr>
-                <w:b/>
-              </w:rPr>
-              <w:t>Build Command</w:t>
-            </w:r>
-          </w:p>
-        </w:tc>
-        <w:tc>
-          <w:tcPr>
-            <w:tcW w:type="dxa" w:w="4320"/>
-          </w:tcPr>
-          <w:p>
-            <w:r>
-              <w:t>pip install -r requirements.txt</w:t>
-            </w:r>
-          </w:p>
-        </w:tc>
-      </w:tr>
-      <w:tr>
-        <w:tc>
-          <w:tcPr>
-            <w:tcW w:type="dxa" w:w="4320"/>
-          </w:tcPr>
-          <w:p>
-            <w:r>
-              <w:rPr>
-                <w:b/>
-              </w:rPr>
-              <w:t>Start Command</w:t>
-            </w:r>
-          </w:p>
-        </w:tc>
-        <w:tc>
-          <w:tcPr>
-            <w:tcW w:type="dxa" w:w="4320"/>
-          </w:tcPr>
-          <w:p>
-            <w:r>
-              <w:t>uvicorn main:app --host 0.0.0.0 --port $PORT</w:t>
-            </w:r>
-          </w:p>
-        </w:tc>
-      </w:tr>
-    </w:tbl>
     <w:p>
       <w:pPr>
-        <w:spacing w:after="120"/>
+        <w:pStyle w:val="ListBullet"/>
       </w:pPr>
-    </w:p>
-    <w:p>
       <w:r>
-        <w:t>Under the Environment tab, define DB_HOST, DB_USER, DB_PASS, DB_NAME, and DB_PORT variables. Once defined, click Deploy, and Render will serve the FastAPI application globally.</w:t>
+        <w:rPr>
+          <w:b/>
+        </w:rPr>
+        <w:t xml:space="preserve">Environment variables: </w:t>
+      </w:r>
+      <w:r>
+        <w:t>Define DB_HOST, DB_USER, DB_PASS, DB_NAME, and DB_PORT under the Environment Settings tab.</w:t>
       </w:r>
     </w:p>
     <w:sectPr>
@@ -1160,9 +778,9 @@
     <w:qFormat/>
     <w:rsid w:val="00FC693F"/>
     <w:rPr>
-      <w:rFonts w:ascii="Arial" w:hAnsi="Arial"/>
+      <w:rFonts w:ascii="Segoe UI" w:hAnsi="Segoe UI"/>
       <w:color w:val="374151"/>
-      <w:sz w:val="22"/>
+      <w:sz w:val="21"/>
     </w:rPr>
   </w:style>
   <w:style w:type="paragraph" w:styleId="Header">

</xml_diff>